<commit_message>
fix: correct spelling of Dr. Rahul Chaurasia in report
</commit_message>
<xml_diff>
--- a/Community_Hero_Phase_III_Project_Report.docx
+++ b/Community_Hero_Phase_III_Project_Report.docx
@@ -392,7 +392,7 @@
         <w:tab/>
         <w:tab/>
         <w:tab/>
-        <w:t>Dr. Rahul Chourasia</w:t>
+        <w:t>Dr. Rahul Chaurasia</w:t>
         <w:br/>
         <w:t>Assistant Professor</w:t>
         <w:tab/>
@@ -645,7 +645,7 @@
           <w:color w:val="222222"/>
           <w:sz w:val="24"/>
         </w:rPr>
-        <w:t>Our sincere thanks to the Department Coordinator, Dr. Rahul Chourasia, for the support and encouragement provided during the completion of the project. We also thank all the faculty members of the CSE department for clarifying our doubts and providing continuous direction.</w:t>
+        <w:t>Our sincere thanks to the Department Coordinator, Dr. Rahul Chaurasia, for the support and encouragement provided during the completion of the project. We also thank all the faculty members of the CSE department for clarifying our doubts and providing continuous direction.</w:t>
       </w:r>
     </w:p>
     <w:p>

</xml_diff>

<commit_message>
docs: add formal in-text citations to Literature Review and remove all em/en dashes
</commit_message>
<xml_diff>
--- a/Community_Hero_Phase_III_Project_Report.docx
+++ b/Community_Hero_Phase_III_Project_Report.docx
@@ -978,7 +978,7 @@
           <w:color w:val="000000"/>
           <w:sz w:val="22"/>
         </w:rPr>
-        <w:t>12</w:t>
+        <w:t>13</w:t>
       </w:r>
     </w:p>
     <w:p>
@@ -1009,7 +1009,7 @@
           <w:color w:val="000000"/>
           <w:sz w:val="22"/>
         </w:rPr>
-        <w:t>14</w:t>
+        <w:t>15</w:t>
       </w:r>
     </w:p>
     <w:p>
@@ -1040,7 +1040,7 @@
           <w:color w:val="000000"/>
           <w:sz w:val="22"/>
         </w:rPr>
-        <w:t>16</w:t>
+        <w:t>17</w:t>
       </w:r>
     </w:p>
     <w:p>
@@ -1071,7 +1071,7 @@
           <w:color w:val="000000"/>
           <w:sz w:val="22"/>
         </w:rPr>
-        <w:t>17</w:t>
+        <w:t>18</w:t>
       </w:r>
     </w:p>
     <w:p>
@@ -1102,7 +1102,7 @@
           <w:color w:val="000000"/>
           <w:sz w:val="22"/>
         </w:rPr>
-        <w:t>21</w:t>
+        <w:t>22</w:t>
       </w:r>
     </w:p>
     <w:p>
@@ -1133,7 +1133,7 @@
           <w:color w:val="000000"/>
           <w:sz w:val="22"/>
         </w:rPr>
-        <w:t>23</w:t>
+        <w:t>24</w:t>
       </w:r>
     </w:p>
     <w:p>
@@ -1164,7 +1164,7 @@
           <w:color w:val="000000"/>
           <w:sz w:val="22"/>
         </w:rPr>
-        <w:t>25</w:t>
+        <w:t>26</w:t>
       </w:r>
     </w:p>
     <w:p>
@@ -1195,7 +1195,7 @@
           <w:color w:val="000000"/>
           <w:sz w:val="22"/>
         </w:rPr>
-        <w:t>26</w:t>
+        <w:t>27</w:t>
       </w:r>
     </w:p>
     <w:p>
@@ -1226,7 +1226,7 @@
           <w:color w:val="000000"/>
           <w:sz w:val="22"/>
         </w:rPr>
-        <w:t>27</w:t>
+        <w:t>28</w:t>
       </w:r>
     </w:p>
     <w:p>
@@ -1257,7 +1257,7 @@
           <w:color w:val="000000"/>
           <w:sz w:val="22"/>
         </w:rPr>
-        <w:t>28</w:t>
+        <w:t>29</w:t>
       </w:r>
     </w:p>
     <w:p>
@@ -1309,7 +1309,7 @@
           <w:color w:val="000000"/>
           <w:sz w:val="21"/>
         </w:rPr>
-        <w:t>17</w:t>
+        <w:t>18</w:t>
       </w:r>
     </w:p>
     <w:p>
@@ -1340,7 +1340,7 @@
           <w:color w:val="000000"/>
           <w:sz w:val="21"/>
         </w:rPr>
-        <w:t>18</w:t>
+        <w:t>19</w:t>
       </w:r>
     </w:p>
     <w:p>
@@ -1371,7 +1371,7 @@
           <w:color w:val="000000"/>
           <w:sz w:val="21"/>
         </w:rPr>
-        <w:t>18</w:t>
+        <w:t>19</w:t>
       </w:r>
     </w:p>
     <w:p>
@@ -1402,7 +1402,7 @@
           <w:color w:val="000000"/>
           <w:sz w:val="21"/>
         </w:rPr>
-        <w:t>19</w:t>
+        <w:t>20</w:t>
       </w:r>
     </w:p>
     <w:p>
@@ -1433,7 +1433,7 @@
           <w:color w:val="000000"/>
           <w:sz w:val="21"/>
         </w:rPr>
-        <w:t>19</w:t>
+        <w:t>20</w:t>
       </w:r>
     </w:p>
     <w:p>
@@ -1464,7 +1464,7 @@
           <w:color w:val="000000"/>
           <w:sz w:val="21"/>
         </w:rPr>
-        <w:t>20</w:t>
+        <w:t>21</w:t>
       </w:r>
     </w:p>
     <w:p>
@@ -1495,7 +1495,7 @@
           <w:color w:val="000000"/>
           <w:sz w:val="21"/>
         </w:rPr>
-        <w:t>20</w:t>
+        <w:t>21</w:t>
       </w:r>
     </w:p>
     <w:p>
@@ -1547,7 +1547,7 @@
           <w:color w:val="000000"/>
           <w:sz w:val="21"/>
         </w:rPr>
-        <w:t>11</w:t>
+        <w:t>12</w:t>
       </w:r>
     </w:p>
     <w:p>
@@ -1578,7 +1578,7 @@
           <w:color w:val="000000"/>
           <w:sz w:val="21"/>
         </w:rPr>
-        <w:t>12</w:t>
+        <w:t>13</w:t>
       </w:r>
     </w:p>
     <w:p>
@@ -1609,7 +1609,7 @@
           <w:color w:val="000000"/>
           <w:sz w:val="21"/>
         </w:rPr>
-        <w:t>15</w:t>
+        <w:t>16</w:t>
       </w:r>
     </w:p>
     <w:p>
@@ -1640,7 +1640,7 @@
           <w:color w:val="000000"/>
           <w:sz w:val="21"/>
         </w:rPr>
-        <w:t>21</w:t>
+        <w:t>22</w:t>
       </w:r>
     </w:p>
     <w:p>
@@ -1671,7 +1671,7 @@
           <w:color w:val="000000"/>
           <w:sz w:val="21"/>
         </w:rPr>
-        <w:t>22</w:t>
+        <w:t>23</w:t>
       </w:r>
     </w:p>
     <w:p>
@@ -1702,7 +1702,7 @@
           <w:color w:val="000000"/>
           <w:sz w:val="21"/>
         </w:rPr>
-        <w:t>23</w:t>
+        <w:t>24</w:t>
       </w:r>
     </w:p>
     <w:p>
@@ -1733,7 +1733,7 @@
           <w:color w:val="000000"/>
           <w:sz w:val="21"/>
         </w:rPr>
-        <w:t>23</w:t>
+        <w:t>24</w:t>
       </w:r>
     </w:p>
     <w:p>
@@ -1764,7 +1764,7 @@
           <w:color w:val="000000"/>
           <w:sz w:val="21"/>
         </w:rPr>
-        <w:t>24</w:t>
+        <w:t>25</w:t>
       </w:r>
     </w:p>
     <w:p>
@@ -1795,7 +1795,7 @@
           <w:color w:val="000000"/>
           <w:sz w:val="21"/>
         </w:rPr>
-        <w:t>24</w:t>
+        <w:t>25</w:t>
       </w:r>
     </w:p>
     <w:p>
@@ -1833,7 +1833,7 @@
           <w:color w:val="222222"/>
           <w:sz w:val="24"/>
         </w:rPr>
-        <w:t>Reporting everyday civic problems—like potholes, broken streetlights, water pipeline leaks, overflowing garbage bins, and sparking electrical wires—is often slow and frustrating. Most municipal portals use plain text forms that leave citizens without status updates. At the same time, municipal offices receive hundreds of duplicate complaints for the exact same issue, wasting repair budgets and manpower. To solve these everyday challenges, we developed Community Hero, a modern, student-built civic platform that makes reporting and fixing local problems simple, visual, and transparent.</w:t>
+        <w:t>Reporting everyday civic problems, such as potholes, broken streetlights, water pipeline leaks, overflowing garbage bins, and sparking electrical wires, is often slow and frustrating. Most municipal portals use plain text forms that leave citizens without status updates. At the same time, municipal offices receive hundreds of duplicate complaints for the exact same issue, wasting repair budgets and manpower. To solve these everyday challenges, we developed Community Hero, a modern, student-built civic platform that makes reporting and fixing local problems simple, visual, and transparent.</w:t>
       </w:r>
     </w:p>
     <w:p>
@@ -1952,7 +1952,7 @@
           <w:color w:val="222222"/>
           <w:sz w:val="24"/>
         </w:rPr>
-        <w:t>In Indian cities, public infrastructure issues like broken roads, dark streets, leaking water pipes, open drains, and garbage dumps create daily inconvenience and safety hazards. Traditional methods for reporting these issues—such as visiting municipal offices in person, calling busy helplines, or filling out long web forms—are slow and rarely provide updates to the citizen.</w:t>
+        <w:t>In Indian cities, public infrastructure issues like broken roads, dark streets, leaking water pipes, open drains, and garbage dumps create daily inconvenience and safety hazards. Traditional methods for reporting these issues, such as visiting municipal offices in person, calling busy helplines, or filling out long web forms, are slow and rarely provide updates to the citizen.</w:t>
       </w:r>
     </w:p>
     <w:p>
@@ -2240,7 +2240,7 @@
           <w:color w:val="222222"/>
           <w:sz w:val="24"/>
         </w:rPr>
-        <w:t>Platforms like FixMyStreet (UK) and SeeClickFix (USA) showed that letting citizens pin issues on a map speeds up repairs. However, these systems rely mainly on 2D form inputs, do not offer interactive 3D visualization, lack voice reporting in regional languages, and do not include automated spatial duplicate grouping.</w:t>
+        <w:t>Platforms like FixMyStreet in the United Kingdom and SeeClickFix in North America demonstrated that allowing citizens to report local issues directly on maps speeds up municipal repairs [1], [3]. These initiatives established open frameworks that helped shape the Open311 GeoReport v2 standard [2]. However, these systems rely primarily on 2D form inputs, do not offer interactive 3D visualizations, lack voice reporting in regional languages, and do not include automated spatial duplicate grouping.</w:t>
       </w:r>
     </w:p>
     <w:p>
@@ -2273,7 +2273,7 @@
           <w:color w:val="222222"/>
           <w:sz w:val="24"/>
         </w:rPr>
-        <w:t>Text classification is a well-established area in Natural Language Processing. Algorithms like Multinomial Naive Bayes combined with TF-IDF feature extraction are fast, lightweight, and effective for sorting short text messages. Training our model on local civic complaints allows the system to classify tickets instantly without any external cloud fees or internet dependencies.</w:t>
+        <w:t>Text classification is an established area in Natural Language Processing. Machine learning algorithms such as Multinomial Naive Bayes and Support Vector Machines, when combined with Term Frequency-Inverse Document Frequency (TF-IDF) feature extraction, offer high classification accuracy with low compute requirements [6], [16]. Training our model locally on labeled municipal records avoids external cloud API expenses and provides instant, privacy-preserving classification on the local server [6].</w:t>
       </w:r>
     </w:p>
     <w:p>
@@ -2290,7 +2290,7 @@
           <w:color w:val="000000"/>
           <w:sz w:val="25"/>
         </w:rPr>
-        <w:t>3.3 3D Graphics on the Web (Three.js)</w:t>
+        <w:t>3.3 3D Graphics and Geospatial Digital Twins</w:t>
       </w:r>
     </w:p>
     <w:p>
@@ -2306,7 +2306,7 @@
           <w:color w:val="222222"/>
           <w:sz w:val="24"/>
         </w:rPr>
-        <w:t>With WebGL and Three.js, web browsers can render hardware-accelerated 3D graphics smoothly. Research shows that 3D spatial representations improve user engagement and help people understand citywide patterns better than flat maps. In Community Hero, Three.js renders a 3D Earth model with color-coded pins for active issues.</w:t>
+        <w:t>Modern web browsers can render hardware-accelerated 3D graphics smoothly using WebGL and Three.js without requiring third-party plugins [4], [9]. Research by Biljecki et al. indicates that 3D city models improve user engagement and cognitive understanding of spatial clusters compared to flat 2D maps [5]. Combining a 3D Earth digital twin with a 2D Leaflet street map [10] provides both a citywide overview and street-level precision.</w:t>
       </w:r>
     </w:p>
     <w:p>
@@ -2323,7 +2323,73 @@
           <w:color w:val="000000"/>
           <w:sz w:val="25"/>
         </w:rPr>
-        <w:t>3.4 Summary and Research Gap</w:t>
+        <w:t>3.4 Multilingual Voice Telephony in Civic Reporting</w:t>
+      </w:r>
+    </w:p>
+    <w:p>
+      <w:pPr>
+        <w:spacing w:before="0" w:after="100" w:line="276" w:lineRule="auto"/>
+        <w:jc w:val="both"/>
+      </w:pPr>
+      <w:r>
+        <w:rPr>
+          <w:rFonts w:ascii="Times New Roman" w:hAnsi="Times New Roman"/>
+          <w:b w:val="0"/>
+          <w:i w:val="0"/>
+          <w:color w:val="222222"/>
+          <w:sz w:val="24"/>
+        </w:rPr>
+        <w:t>Voice intake removes barriers for citizens who find typing in English difficult [3]. Modern web standards such as the W3C Web Speech API [13] and conversational telephony frameworks like Bolna [14] allow spoken words in Hindi and English to be converted into structured data. In combination with Server-Sent Events [7], the system pushes real-time updates directly to administrative dashboards.</w:t>
+      </w:r>
+    </w:p>
+    <w:p>
+      <w:pPr>
+        <w:keepNext/>
+        <w:spacing w:before="220" w:after="60"/>
+        <w:jc w:val="left"/>
+      </w:pPr>
+      <w:r>
+        <w:rPr>
+          <w:rFonts w:ascii="Times New Roman" w:hAnsi="Times New Roman"/>
+          <w:b/>
+          <w:i w:val="0"/>
+          <w:color w:val="000000"/>
+          <w:sz w:val="25"/>
+        </w:rPr>
+        <w:t>3.5 Spatial Duplicate Detection and Clustering</w:t>
+      </w:r>
+    </w:p>
+    <w:p>
+      <w:pPr>
+        <w:spacing w:before="0" w:after="100" w:line="276" w:lineRule="auto"/>
+        <w:jc w:val="both"/>
+      </w:pPr>
+      <w:r>
+        <w:rPr>
+          <w:rFonts w:ascii="Times New Roman" w:hAnsi="Times New Roman"/>
+          <w:b w:val="0"/>
+          <w:i w:val="0"/>
+          <w:color w:val="222222"/>
+          <w:sz w:val="24"/>
+        </w:rPr>
+        <w:t>The Haversine formula, originally documented by Sinnott [15], provides an efficient method to calculate great-circle distances between GPS coordinates. Using a 75-meter threshold allows municipal systems to cluster duplicate citizen reports automatically, avoiding redundant work orders.</w:t>
+      </w:r>
+    </w:p>
+    <w:p>
+      <w:pPr>
+        <w:keepNext/>
+        <w:spacing w:before="220" w:after="60"/>
+        <w:jc w:val="left"/>
+      </w:pPr>
+      <w:r>
+        <w:rPr>
+          <w:rFonts w:ascii="Times New Roman" w:hAnsi="Times New Roman"/>
+          <w:b/>
+          <w:i w:val="0"/>
+          <w:color w:val="000000"/>
+          <w:sz w:val="25"/>
+        </w:rPr>
+        <w:t>3.6 Summary and Research Gap</w:t>
       </w:r>
     </w:p>
     <w:p>
@@ -9363,7 +9429,7 @@
                 <w:color w:val="222222"/>
                 <w:sz w:val="19"/>
               </w:rPr>
-              <w:t>10m – 35m</w:t>
+              <w:t>10m to 35m</w:t>
             </w:r>
           </w:p>
         </w:tc>
@@ -9505,7 +9571,7 @@
                 <w:color w:val="222222"/>
                 <w:sz w:val="19"/>
               </w:rPr>
-              <w:t>36m – 74m</w:t>
+              <w:t>36m to 74m</w:t>
             </w:r>
           </w:p>
         </w:tc>
@@ -9647,7 +9713,7 @@
                 <w:color w:val="222222"/>
                 <w:sz w:val="19"/>
               </w:rPr>
-              <w:t>76m – 100m</w:t>
+              <w:t>76m to 100m</w:t>
             </w:r>
           </w:p>
         </w:tc>
@@ -9789,7 +9855,7 @@
                 <w:color w:val="222222"/>
                 <w:sz w:val="19"/>
               </w:rPr>
-              <w:t>101m – 150m</w:t>
+              <w:t>101m to 150m</w:t>
             </w:r>
           </w:p>
         </w:tc>
@@ -11956,6 +12022,70 @@
           <w:sz w:val="20"/>
         </w:rPr>
         <w:t>[12] Express.js Authors, "Express: Fast, Minimalist Web Framework for Node.js," 2024. [Online]. Available: https://expressjs.com.</w:t>
+      </w:r>
+    </w:p>
+    <w:p>
+      <w:pPr>
+        <w:spacing w:before="50" w:after="70" w:line="276" w:lineRule="auto"/>
+        <w:jc w:val="both"/>
+      </w:pPr>
+      <w:r>
+        <w:rPr>
+          <w:rFonts w:ascii="Times New Roman" w:hAnsi="Times New Roman"/>
+          <w:b w:val="0"/>
+          <w:i w:val="0"/>
+          <w:color w:val="222222"/>
+          <w:sz w:val="20"/>
+        </w:rPr>
+        <w:t>[13] W3C Voice Browser Working Group, "Web Speech API Specification," W3C Community Draft, 2023.</w:t>
+      </w:r>
+    </w:p>
+    <w:p>
+      <w:pPr>
+        <w:spacing w:before="50" w:after="70" w:line="276" w:lineRule="auto"/>
+        <w:jc w:val="both"/>
+      </w:pPr>
+      <w:r>
+        <w:rPr>
+          <w:rFonts w:ascii="Times New Roman" w:hAnsi="Times New Roman"/>
+          <w:b w:val="0"/>
+          <w:i w:val="0"/>
+          <w:color w:val="222222"/>
+          <w:sz w:val="20"/>
+        </w:rPr>
+        <w:t>[14] Bolna AI, "Conversational Voice AI Agent Framework Documentation," 2026. [Online]. Available: https://bolna.ai.</w:t>
+      </w:r>
+    </w:p>
+    <w:p>
+      <w:pPr>
+        <w:spacing w:before="50" w:after="70" w:line="276" w:lineRule="auto"/>
+        <w:jc w:val="both"/>
+      </w:pPr>
+      <w:r>
+        <w:rPr>
+          <w:rFonts w:ascii="Times New Roman" w:hAnsi="Times New Roman"/>
+          <w:b w:val="0"/>
+          <w:i w:val="0"/>
+          <w:color w:val="222222"/>
+          <w:sz w:val="20"/>
+        </w:rPr>
+        <w:t>[15] R. W. Sinnott, "Virtues of the Haversine," Sky and Telescope, vol. 68, no. 2, p. 159, 1984.</w:t>
+      </w:r>
+    </w:p>
+    <w:p>
+      <w:pPr>
+        <w:spacing w:before="50" w:after="70" w:line="276" w:lineRule="auto"/>
+        <w:jc w:val="both"/>
+      </w:pPr>
+      <w:r>
+        <w:rPr>
+          <w:rFonts w:ascii="Times New Roman" w:hAnsi="Times New Roman"/>
+          <w:b w:val="0"/>
+          <w:i w:val="0"/>
+          <w:color w:val="222222"/>
+          <w:sz w:val="20"/>
+        </w:rPr>
+        <w:t>[16] T. Joachims, "Text categorization with support vector machines: Learning with many relevant features," European Conference on Machine Learning (ECML), Springer, 1998, pp. 137-142.</w:t>
       </w:r>
     </w:p>
     <w:p>

</xml_diff>

<commit_message>
docs: replace slide figures with real website screenshots on pages 19, 20, 21
</commit_message>
<xml_diff>
--- a/Community_Hero_Phase_III_Project_Report.docx
+++ b/Community_Hero_Phase_III_Project_Report.docx
@@ -5510,7 +5510,7 @@
       <w:r>
         <w:drawing>
           <wp:inline xmlns:a="http://schemas.openxmlformats.org/drawingml/2006/main" xmlns:pic="http://schemas.openxmlformats.org/drawingml/2006/picture">
-            <wp:extent cx="4389120" cy="2449741"/>
+            <wp:extent cx="4389120" cy="2743200"/>
             <wp:docPr id="6" name="Picture 6"/>
             <wp:cNvGraphicFramePr>
               <a:graphicFrameLocks noChangeAspect="1"/>
@@ -5519,7 +5519,7 @@
               <a:graphicData uri="http://schemas.openxmlformats.org/drawingml/2006/picture">
                 <pic:pic>
                   <pic:nvPicPr>
-                    <pic:cNvPr id="0" name="slide_globe.jpg"/>
+                    <pic:cNvPr id="0" name="web_globe_map.png"/>
                     <pic:cNvPicPr/>
                   </pic:nvPicPr>
                   <pic:blipFill>
@@ -5531,7 +5531,7 @@
                   <pic:spPr>
                     <a:xfrm>
                       <a:off x="0" y="0"/>
-                      <a:ext cx="4389120" cy="2449741"/>
+                      <a:ext cx="4389120" cy="2743200"/>
                     </a:xfrm>
                     <a:prstGeom prst="rect"/>
                   </pic:spPr>
@@ -5600,7 +5600,7 @@
       <w:r>
         <w:drawing>
           <wp:inline xmlns:a="http://schemas.openxmlformats.org/drawingml/2006/main" xmlns:pic="http://schemas.openxmlformats.org/drawingml/2006/picture">
-            <wp:extent cx="4389120" cy="2486508"/>
+            <wp:extent cx="4389120" cy="2743200"/>
             <wp:docPr id="7" name="Picture 7"/>
             <wp:cNvGraphicFramePr>
               <a:graphicFrameLocks noChangeAspect="1"/>
@@ -5609,7 +5609,7 @@
               <a:graphicData uri="http://schemas.openxmlformats.org/drawingml/2006/picture">
                 <pic:pic>
                   <pic:nvPicPr>
-                    <pic:cNvPr id="0" name="slide_voice.png"/>
+                    <pic:cNvPr id="0" name="web_voice_cockpit.png"/>
                     <pic:cNvPicPr/>
                   </pic:nvPicPr>
                   <pic:blipFill>
@@ -5621,7 +5621,7 @@
                   <pic:spPr>
                     <a:xfrm>
                       <a:off x="0" y="0"/>
-                      <a:ext cx="4389120" cy="2486508"/>
+                      <a:ext cx="4389120" cy="2743200"/>
                     </a:xfrm>
                     <a:prstGeom prst="rect"/>
                   </pic:spPr>
@@ -5690,7 +5690,7 @@
       <w:r>
         <w:drawing>
           <wp:inline xmlns:a="http://schemas.openxmlformats.org/drawingml/2006/main" xmlns:pic="http://schemas.openxmlformats.org/drawingml/2006/picture">
-            <wp:extent cx="4389120" cy="2449741"/>
+            <wp:extent cx="4389120" cy="2743200"/>
             <wp:docPr id="8" name="Picture 8"/>
             <wp:cNvGraphicFramePr>
               <a:graphicFrameLocks noChangeAspect="1"/>
@@ -5699,7 +5699,7 @@
               <a:graphicData uri="http://schemas.openxmlformats.org/drawingml/2006/picture">
                 <pic:pic>
                   <pic:nvPicPr>
-                    <pic:cNvPr id="0" name="slide_command.jpg"/>
+                    <pic:cNvPr id="0" name="web_dashboard.png"/>
                     <pic:cNvPicPr/>
                   </pic:nvPicPr>
                   <pic:blipFill>
@@ -5711,7 +5711,7 @@
                   <pic:spPr>
                     <a:xfrm>
                       <a:off x="0" y="0"/>
-                      <a:ext cx="4389120" cy="2449741"/>
+                      <a:ext cx="4389120" cy="2743200"/>
                     </a:xfrm>
                     <a:prstGeom prst="rect"/>
                   </pic:spPr>
@@ -5780,7 +5780,7 @@
       <w:r>
         <w:drawing>
           <wp:inline xmlns:a="http://schemas.openxmlformats.org/drawingml/2006/main" xmlns:pic="http://schemas.openxmlformats.org/drawingml/2006/picture">
-            <wp:extent cx="4389120" cy="2449741"/>
+            <wp:extent cx="4389120" cy="2743200"/>
             <wp:docPr id="9" name="Picture 9"/>
             <wp:cNvGraphicFramePr>
               <a:graphicFrameLocks noChangeAspect="1"/>
@@ -5789,7 +5789,7 @@
               <a:graphicData uri="http://schemas.openxmlformats.org/drawingml/2006/picture">
                 <pic:pic>
                   <pic:nvPicPr>
-                    <pic:cNvPr id="0" name="slide_citizen_report.jpg"/>
+                    <pic:cNvPr id="0" name="web_citizen_report.png"/>
                     <pic:cNvPicPr/>
                   </pic:nvPicPr>
                   <pic:blipFill>
@@ -5801,7 +5801,7 @@
                   <pic:spPr>
                     <a:xfrm>
                       <a:off x="0" y="0"/>
-                      <a:ext cx="4389120" cy="2449741"/>
+                      <a:ext cx="4389120" cy="2743200"/>
                     </a:xfrm>
                     <a:prstGeom prst="rect"/>
                   </pic:spPr>
@@ -5870,7 +5870,7 @@
       <w:r>
         <w:drawing>
           <wp:inline xmlns:a="http://schemas.openxmlformats.org/drawingml/2006/main" xmlns:pic="http://schemas.openxmlformats.org/drawingml/2006/picture">
-            <wp:extent cx="4389120" cy="2449741"/>
+            <wp:extent cx="4389120" cy="2743200"/>
             <wp:docPr id="10" name="Picture 10"/>
             <wp:cNvGraphicFramePr>
               <a:graphicFrameLocks noChangeAspect="1"/>
@@ -5879,7 +5879,7 @@
               <a:graphicData uri="http://schemas.openxmlformats.org/drawingml/2006/picture">
                 <pic:pic>
                   <pic:nvPicPr>
-                    <pic:cNvPr id="0" name="slide_repair_work.jpg"/>
+                    <pic:cNvPr id="0" name="web_admin_console.png"/>
                     <pic:cNvPicPr/>
                   </pic:nvPicPr>
                   <pic:blipFill>
@@ -5891,7 +5891,7 @@
                   <pic:spPr>
                     <a:xfrm>
                       <a:off x="0" y="0"/>
-                      <a:ext cx="4389120" cy="2449741"/>
+                      <a:ext cx="4389120" cy="2743200"/>
                     </a:xfrm>
                     <a:prstGeom prst="rect"/>
                   </pic:spPr>

</xml_diff>